<commit_message>
Some last cleanups for UndertheHood and the complete entries for CommonCents and the Intro for Jan 2026
</commit_message>
<xml_diff>
--- a/Posts/2026/01(Jan)/UndertheHood/UTH_01(Jan)_2026_CR3BP_Part2.docx
+++ b/Posts/2026/01(Jan)/UndertheHood/UTH_01(Jan)_2026_CR3BP_Part2.docx
@@ -43,13 +43,11 @@
       </w:r>
       <w:proofErr w:type="spellEnd"/>
       <w:r>
-        <w:t xml:space="preserve">) move in circular motion about their common center of mass, ignorant of the presence of a third body. Since this third body doesn't </w:t>
-      </w:r>
-      <w:proofErr w:type="gramStart"/>
-      <w:r>
-        <w:t>influence of</w:t>
-      </w:r>
-      <w:proofErr w:type="gramEnd"/>
+        <w:t>) move in circular motion about their common center of mass, ignorant of the presence of a third body. Since this third body doesn't influence o</w:t>
+      </w:r>
+      <w:r>
+        <w:t>r</w:t>
+      </w:r>
       <w:r>
         <w:t xml:space="preserve"> back-react onto the </w:t>
       </w:r>
@@ -82,12 +80,10 @@
       <w:r>
         <w:t xml:space="preserve"> on the restricted body result from a `schedule' and do not arise naturally from the motion of all three. The restricted body is, therefore, driven by </w:t>
       </w:r>
-      <w:proofErr w:type="spellStart"/>
       <w:proofErr w:type="gramStart"/>
       <w:r>
         <w:t>a</w:t>
       </w:r>
-      <w:proofErr w:type="spellEnd"/>
       <w:proofErr w:type="gramEnd"/>
       <w:r>
         <w:t xml:space="preserve"> external, time varying force making the inertial equations of motion non-autonomous.</w:t>
@@ -103,20 +99,7 @@
         <w:pStyle w:val="NoSpacing"/>
       </w:pPr>
       <w:r>
-        <w:t xml:space="preserve">Nonetheless, because of </w:t>
-      </w:r>
-      <w:proofErr w:type="gramStart"/>
-      <w:r>
-        <w:t xml:space="preserve">the </w:t>
-      </w:r>
-      <w:proofErr w:type="spellStart"/>
-      <w:r>
-        <w:t>the</w:t>
-      </w:r>
-      <w:proofErr w:type="spellEnd"/>
-      <w:proofErr w:type="gramEnd"/>
-      <w:r>
-        <w:t xml:space="preserve"> special property that the </w:t>
+        <w:t xml:space="preserve">Nonetheless, because of the requirement that the </w:t>
       </w:r>
       <w:proofErr w:type="spellStart"/>
       <w:r>
@@ -124,39 +107,46 @@
       </w:r>
       <w:proofErr w:type="spellEnd"/>
       <w:r>
-        <w:t xml:space="preserve"> are moving in circular motion, unique of all Keplerian motion in that </w:t>
-      </w:r>
-      <w:proofErr w:type="gramStart"/>
-      <w:r>
-        <w:t>is</w:t>
-      </w:r>
-      <w:proofErr w:type="gramEnd"/>
-      <w:r>
-        <w:t xml:space="preserve"> has a fixed angular frequency, we can move to a co-rotating frame in which the equations of motion are autonomous. The cost of that simplification is that there are now `Coriolis' type forces </w:t>
-      </w:r>
-    </w:p>
-    <w:p>
-      <w:pPr>
-        <w:pStyle w:val="NoSpacing"/>
-      </w:pPr>
-      <w:r>
-        <w:t xml:space="preserve">%{https://grokipedia.com/page/Coriolis_force} </w:t>
-      </w:r>
-    </w:p>
-    <w:p>
-      <w:pPr>
-        <w:pStyle w:val="NoSpacing"/>
-      </w:pPr>
-      <w:r>
-        <w:t>($-2{\</w:t>
-      </w:r>
-      <w:proofErr w:type="spellStart"/>
-      <w:r>
-        <w:t>vec</w:t>
-      </w:r>
-      <w:proofErr w:type="spellEnd"/>
-      <w:r>
-        <w:t xml:space="preserve"> \</w:t>
+        <w:t xml:space="preserve"> are moving in circular orbits, their motion has a fixed angular frequency (a feature unique in Keplerian orbits) and we can move to a co-rotating frame in which the equations of motion are autonomous. The cost of that simplification is that there are now </w:t>
+      </w:r>
+      <w:hyperlink r:id="rId4" w:history="1">
+        <w:r>
+          <w:rPr>
+            <w:rStyle w:val="Hyperlink"/>
+          </w:rPr>
+          <w:t xml:space="preserve">`Coriolis' </w:t>
+        </w:r>
+        <w:proofErr w:type="gramStart"/>
+        <w:r>
+          <w:rPr>
+            <w:rStyle w:val="Hyperlink"/>
+          </w:rPr>
+          <w:t xml:space="preserve">type </w:t>
+        </w:r>
+        <w:r>
+          <w:rPr>
+            <w:rStyle w:val="Hyperlink"/>
+          </w:rPr>
+          <w:t xml:space="preserve"> </w:t>
+        </w:r>
+        <w:r>
+          <w:rPr>
+            <w:rStyle w:val="Hyperlink"/>
+          </w:rPr>
+          <w:t>forces</w:t>
+        </w:r>
+        <w:proofErr w:type="gramEnd"/>
+      </w:hyperlink>
+      <w:r>
+        <w:t xml:space="preserve"> </w:t>
+      </w:r>
+    </w:p>
+    <w:p>
+      <w:pPr>
+        <w:pStyle w:val="NoSpacing"/>
+      </w:pPr>
+      <w:r>
+        <w:t>($-2{\vec \</w:t>
       </w:r>
       <w:proofErr w:type="gramStart"/>
       <w:r>
@@ -164,15 +154,7 @@
       </w:r>
       <w:proofErr w:type="gramEnd"/>
       <w:r>
-        <w:t>\</w:t>
-      </w:r>
-      <w:proofErr w:type="spellStart"/>
-      <w:r>
-        <w:t>vec</w:t>
-      </w:r>
-      <w:proofErr w:type="spellEnd"/>
-      <w:r>
-        <w:t xml:space="preserve"> </w:t>
+        <w:t xml:space="preserve">\vec </w:t>
       </w:r>
       <w:proofErr w:type="gramStart"/>
       <w:r>
@@ -370,695 +352,667 @@
         <w:pStyle w:val="NoSpacing"/>
       </w:pPr>
       <w:r>
-        <w:t>Note that we've rearrange the result from last month so that the right-hand sides contain only the purely gravitational terms and that the terms linear in $x$ and $y$, which are centrifugal ($-{\</w:t>
-      </w:r>
-      <w:proofErr w:type="spellStart"/>
-      <w:r>
-        <w:t>vec</w:t>
-      </w:r>
-      <w:proofErr w:type="spellEnd"/>
-      <w:r>
-        <w:t xml:space="preserve"> \omega}\times({\</w:t>
-      </w:r>
-      <w:proofErr w:type="spellStart"/>
-      <w:r>
-        <w:t>vec</w:t>
-      </w:r>
-      <w:proofErr w:type="spellEnd"/>
-      <w:r>
-        <w:t xml:space="preserve"> \omega} \times {\</w:t>
-      </w:r>
-      <w:proofErr w:type="spellStart"/>
-      <w:r>
-        <w:t>vec</w:t>
-      </w:r>
-      <w:proofErr w:type="spellEnd"/>
-      <w:r>
-        <w:t xml:space="preserve"> r})$ in basic classical mechanics) and result also the time derivatives in the co-rotating frame are back on the left.</w:t>
-      </w:r>
-    </w:p>
-    <w:p>
-      <w:pPr>
-        <w:pStyle w:val="NoSpacing"/>
-      </w:pPr>
-    </w:p>
-    <w:p>
-      <w:pPr>
-        <w:pStyle w:val="NoSpacing"/>
-      </w:pPr>
-      <w:r>
-        <w:t xml:space="preserve">As discussed last month, despite the mixing of the in-plane inertial coordinates that results when moving to the co-rotating frame, the resulting gravitational terms result as if we had simply constructed them in the co-rotating frame to begin with. This is not a </w:t>
-      </w:r>
-      <w:proofErr w:type="spellStart"/>
-      <w:r>
-        <w:t>coincedent</w:t>
-      </w:r>
-      <w:proofErr w:type="spellEnd"/>
+        <w:t>Note that we've rearrange the result from last month so that the right-hand sides contain only the purely gravitational terms and that the terms linear in $x$ and $y$, which are centrifugal ($-{\vec \omega}\times({\vec \omega} \times {\vec r})$ in basic classical mechanics) and also the result of time derivatives in the co-rotating frame, are back on the left.</w:t>
+      </w:r>
+    </w:p>
+    <w:p>
+      <w:pPr>
+        <w:pStyle w:val="NoSpacing"/>
+      </w:pPr>
+    </w:p>
+    <w:p>
+      <w:pPr>
+        <w:pStyle w:val="NoSpacing"/>
+      </w:pPr>
+      <w:r>
+        <w:t xml:space="preserve">As discussed last month, despite the mixing of the in-plane inertial coordinates that results when moving to the co-rotating frame, the gravitational terms </w:t>
+      </w:r>
+      <w:r>
+        <w:t xml:space="preserve">appear </w:t>
+      </w:r>
+      <w:r>
+        <w:t xml:space="preserve">as if we had simply constructed them in the co-rotating frame to begin with. This is not a </w:t>
+      </w:r>
+      <w:r>
+        <w:t>coincidence</w:t>
+      </w:r>
       <w:r>
         <w:t xml:space="preserve"> but </w:t>
       </w:r>
       <w:r>
+        <w:t xml:space="preserve">a </w:t>
+      </w:r>
+      <w:r>
+        <w:t xml:space="preserve">result of the fact that (unlike velocities) accelerations and forces are vectors that `live' in the configuration space of the system. </w:t>
+      </w:r>
+    </w:p>
+    <w:p>
+      <w:pPr>
+        <w:pStyle w:val="NoSpacing"/>
+      </w:pPr>
+    </w:p>
+    <w:p>
+      <w:pPr>
+        <w:pStyle w:val="NoSpacing"/>
+      </w:pPr>
+      <w:r>
+        <w:t>From elementary classical mechanics, we know that gravitational forces are conservative and result from the taking a gradient of an appropriate potential. Therefore, we can expect that a similar potential, of the form</w:t>
+      </w:r>
+    </w:p>
+    <w:p>
+      <w:pPr>
+        <w:pStyle w:val="NoSpacing"/>
+      </w:pPr>
+    </w:p>
+    <w:p>
+      <w:pPr>
+        <w:pStyle w:val="NoSpacing"/>
+      </w:pPr>
+      <w:proofErr w:type="gramStart"/>
+      <w:r>
+        <w:t>\[</w:t>
+      </w:r>
+      <w:proofErr w:type="gramEnd"/>
+      <w:r>
+        <w:t xml:space="preserve"> {\tilde U} = -\frac{m_</w:t>
+      </w:r>
+      <w:proofErr w:type="gramStart"/>
+      <w:r>
+        <w:t>1}{</w:t>
+      </w:r>
+      <w:proofErr w:type="gramEnd"/>
+      <w:r>
+        <w:t>d_1} - \frac{m_</w:t>
+      </w:r>
+      <w:proofErr w:type="gramStart"/>
+      <w:r>
+        <w:t>2}{</w:t>
+      </w:r>
+      <w:proofErr w:type="gramEnd"/>
+      <w:r>
+        <w:t>d_2} = - \frac{1-\</w:t>
+      </w:r>
+      <w:proofErr w:type="gramStart"/>
+      <w:r>
+        <w:t>mu}{</w:t>
+      </w:r>
+      <w:proofErr w:type="gramEnd"/>
+      <w:r>
+        <w:t>d_1} - \frac{\</w:t>
+      </w:r>
+      <w:proofErr w:type="gramStart"/>
+      <w:r>
+        <w:t>mu}{</w:t>
+      </w:r>
+      <w:proofErr w:type="gramEnd"/>
+      <w:r>
+        <w:t>d_2} \; \]</w:t>
+      </w:r>
+    </w:p>
+    <w:p>
+      <w:pPr>
+        <w:pStyle w:val="NoSpacing"/>
+      </w:pPr>
+    </w:p>
+    <w:p>
+      <w:pPr>
+        <w:pStyle w:val="NoSpacing"/>
+      </w:pPr>
+      <w:r>
+        <w:t>should give rise to the right-hands sides by taking the appropriate derivatives.</w:t>
+      </w:r>
+    </w:p>
+    <w:p>
+      <w:pPr>
+        <w:pStyle w:val="NoSpacing"/>
+      </w:pPr>
+    </w:p>
+    <w:p>
+      <w:pPr>
+        <w:pStyle w:val="NoSpacing"/>
+      </w:pPr>
+      <w:r>
+        <w:t xml:space="preserve">We can </w:t>
+      </w:r>
+      <w:proofErr w:type="spellStart"/>
+      <w:r>
+        <w:t>verfiy</w:t>
+      </w:r>
+      <w:proofErr w:type="spellEnd"/>
+      <w:r>
+        <w:t xml:space="preserve"> this relatively easily by differentiating $U$ (easier </w:t>
+      </w:r>
+      <w:proofErr w:type="gramStart"/>
+      <w:r>
+        <w:t>that</w:t>
+      </w:r>
+      <w:proofErr w:type="gramEnd"/>
+      <w:r>
+        <w:t xml:space="preserve"> integrating the right-hand sides) and by organizing the derivatives. Defining</w:t>
+      </w:r>
+    </w:p>
+    <w:p>
+      <w:pPr>
+        <w:pStyle w:val="NoSpacing"/>
+      </w:pPr>
+    </w:p>
+    <w:p>
+      <w:pPr>
+        <w:pStyle w:val="NoSpacing"/>
+      </w:pPr>
+      <w:proofErr w:type="gramStart"/>
+      <w:r>
+        <w:t>\[</w:t>
+      </w:r>
+      <w:proofErr w:type="gramEnd"/>
+      <w:r>
+        <w:t xml:space="preserve"> d = \</w:t>
+      </w:r>
+      <w:proofErr w:type="gramStart"/>
+      <w:r>
+        <w:t>sqrt{ (</w:t>
+      </w:r>
+      <w:proofErr w:type="gramEnd"/>
+      <w:r>
+        <w:t>x-x_</w:t>
+      </w:r>
+      <w:proofErr w:type="gramStart"/>
+      <w:r>
+        <w:t>0)^</w:t>
+      </w:r>
+      <w:proofErr w:type="gramEnd"/>
+      <w:r>
+        <w:t>2 + (y-y_</w:t>
+      </w:r>
+      <w:proofErr w:type="gramStart"/>
+      <w:r>
+        <w:t>0)^</w:t>
+      </w:r>
+      <w:proofErr w:type="gramEnd"/>
+      <w:r>
+        <w:t>2 + (z-z_</w:t>
+      </w:r>
+      <w:proofErr w:type="gramStart"/>
+      <w:r>
+        <w:t>0)^2 }</w:t>
+      </w:r>
+      <w:proofErr w:type="gramEnd"/>
+      <w:r>
+        <w:t xml:space="preserve"> \; \]</w:t>
+      </w:r>
+    </w:p>
+    <w:p>
+      <w:pPr>
+        <w:pStyle w:val="NoSpacing"/>
+      </w:pPr>
+    </w:p>
+    <w:p>
+      <w:pPr>
+        <w:pStyle w:val="NoSpacing"/>
+      </w:pPr>
+      <w:r>
+        <w:t xml:space="preserve">we can easily verify that </w:t>
+      </w:r>
+    </w:p>
+    <w:p>
+      <w:pPr>
+        <w:pStyle w:val="NoSpacing"/>
+      </w:pPr>
+    </w:p>
+    <w:p>
+      <w:pPr>
+        <w:pStyle w:val="NoSpacing"/>
+      </w:pPr>
+      <w:proofErr w:type="gramStart"/>
+      <w:r>
+        <w:t>\[</w:t>
+      </w:r>
+      <w:proofErr w:type="gramEnd"/>
+      <w:r>
+        <w:t xml:space="preserve"> \frac{\</w:t>
+      </w:r>
+      <w:proofErr w:type="gramStart"/>
+      <w:r>
+        <w:t>partial}{</w:t>
+      </w:r>
+      <w:proofErr w:type="gramEnd"/>
+      <w:r>
+        <w:t>\partial x} d= \frac{x-x_</w:t>
+      </w:r>
+      <w:proofErr w:type="gramStart"/>
+      <w:r>
+        <w:t>0}{</w:t>
+      </w:r>
+      <w:proofErr w:type="gramEnd"/>
+      <w:r>
+        <w:t>d} \; \]</w:t>
+      </w:r>
+    </w:p>
+    <w:p>
+      <w:pPr>
+        <w:pStyle w:val="NoSpacing"/>
+      </w:pPr>
+    </w:p>
+    <w:p>
+      <w:pPr>
+        <w:pStyle w:val="NoSpacing"/>
+      </w:pPr>
+      <w:r>
+        <w:t>and</w:t>
+      </w:r>
+    </w:p>
+    <w:p>
+      <w:pPr>
+        <w:pStyle w:val="NoSpacing"/>
+      </w:pPr>
+    </w:p>
+    <w:p>
+      <w:pPr>
+        <w:pStyle w:val="NoSpacing"/>
+      </w:pPr>
+      <w:proofErr w:type="gramStart"/>
+      <w:r>
+        <w:t>\[</w:t>
+      </w:r>
+      <w:proofErr w:type="gramEnd"/>
+      <w:r>
+        <w:t xml:space="preserve"> \frac{\</w:t>
+      </w:r>
+      <w:proofErr w:type="gramStart"/>
+      <w:r>
+        <w:t>partial}{</w:t>
+      </w:r>
+      <w:proofErr w:type="gramEnd"/>
+      <w:r>
+        <w:t>\partial x} \frac{1}{d} = -\frac{</w:t>
+      </w:r>
+      <w:proofErr w:type="gramStart"/>
+      <w:r>
+        <w:t>1}{</w:t>
+      </w:r>
+      <w:proofErr w:type="gramEnd"/>
+      <w:r>
+        <w:t>d^2} \frac{\</w:t>
+      </w:r>
+      <w:proofErr w:type="gramStart"/>
+      <w:r>
+        <w:t>partial}{</w:t>
+      </w:r>
+      <w:proofErr w:type="gramEnd"/>
+      <w:r>
+        <w:t>\partial x} d= - \frac{x-x_</w:t>
+      </w:r>
+      <w:proofErr w:type="gramStart"/>
+      <w:r>
+        <w:t>0}{</w:t>
+      </w:r>
+      <w:proofErr w:type="gramEnd"/>
+      <w:r>
+        <w:t>d^3} \</w:t>
+      </w:r>
+      <w:proofErr w:type="gramStart"/>
+      <w:r>
+        <w:t>; ,</w:t>
+      </w:r>
+      <w:proofErr w:type="gramEnd"/>
+      <w:r>
+        <w:t xml:space="preserve"> \]</w:t>
+      </w:r>
+    </w:p>
+    <w:p>
+      <w:pPr>
+        <w:pStyle w:val="NoSpacing"/>
+      </w:pPr>
+    </w:p>
+    <w:p>
+      <w:pPr>
+        <w:pStyle w:val="NoSpacing"/>
+      </w:pPr>
+      <w:r>
+        <w:t>with analogous expressions for the derivatives with respect to $y$ and $z$.</w:t>
+      </w:r>
+    </w:p>
+    <w:p>
+      <w:pPr>
+        <w:pStyle w:val="NoSpacing"/>
+      </w:pPr>
+    </w:p>
+    <w:p>
+      <w:pPr>
+        <w:pStyle w:val="NoSpacing"/>
+      </w:pPr>
+      <w:r>
+        <w:t>Following this program, we see that</w:t>
+      </w:r>
+    </w:p>
+    <w:p>
+      <w:pPr>
+        <w:pStyle w:val="NoSpacing"/>
+      </w:pPr>
+    </w:p>
+    <w:p>
+      <w:pPr>
+        <w:pStyle w:val="NoSpacing"/>
+      </w:pPr>
+      <w:proofErr w:type="gramStart"/>
+      <w:r>
+        <w:t>\[</w:t>
+      </w:r>
+      <w:proofErr w:type="gramEnd"/>
+      <w:r>
+        <w:t xml:space="preserve"> \frac{\</w:t>
+      </w:r>
+      <w:proofErr w:type="gramStart"/>
+      <w:r>
+        <w:t>partial}{</w:t>
+      </w:r>
+      <w:proofErr w:type="gramEnd"/>
+      <w:r>
+        <w:t>\partial x} {\tilde U} = -\frac{(1-\</w:t>
+      </w:r>
+      <w:proofErr w:type="gramStart"/>
+      <w:r>
+        <w:t>mu)(</w:t>
+      </w:r>
+      <w:proofErr w:type="gramEnd"/>
+      <w:r>
+        <w:t>x+\mu</w:t>
+      </w:r>
+      <w:proofErr w:type="gramStart"/>
+      <w:r>
+        <w:t>)}{</w:t>
+      </w:r>
+      <w:proofErr w:type="gramEnd"/>
+      <w:r>
+        <w:t>d_1^3} - \frac{\mu(x-1+\mu</w:t>
+      </w:r>
+      <w:proofErr w:type="gramStart"/>
+      <w:r>
+        <w:t>)}{</w:t>
+      </w:r>
+      <w:proofErr w:type="gramEnd"/>
+      <w:r>
+        <w:t>d_2^3} \</w:t>
+      </w:r>
+      <w:proofErr w:type="gramStart"/>
+      <w:r>
+        <w:t>; ,</w:t>
+      </w:r>
+      <w:proofErr w:type="gramEnd"/>
+      <w:r>
+        <w:t xml:space="preserve"> \]</w:t>
+      </w:r>
+    </w:p>
+    <w:p>
+      <w:pPr>
+        <w:pStyle w:val="NoSpacing"/>
+      </w:pPr>
+    </w:p>
+    <w:p>
+      <w:pPr>
+        <w:pStyle w:val="NoSpacing"/>
+      </w:pPr>
+      <w:proofErr w:type="gramStart"/>
+      <w:r>
+        <w:t>\[</w:t>
+      </w:r>
+      <w:proofErr w:type="gramEnd"/>
+      <w:r>
+        <w:t xml:space="preserve"> \frac{\</w:t>
+      </w:r>
+      <w:proofErr w:type="gramStart"/>
+      <w:r>
+        <w:t>partial}{</w:t>
+      </w:r>
+      <w:proofErr w:type="gramEnd"/>
+      <w:r>
+        <w:t xml:space="preserve">\partial y} {\tilde U} = -\frac{(1-\mu) </w:t>
+      </w:r>
+      <w:proofErr w:type="gramStart"/>
+      <w:r>
+        <w:t>y}{</w:t>
+      </w:r>
+      <w:proofErr w:type="gramEnd"/>
+      <w:r>
+        <w:t>d_1^3} - \</w:t>
+      </w:r>
+      <w:proofErr w:type="gramStart"/>
+      <w:r>
+        <w:t>frac{</w:t>
+      </w:r>
+      <w:proofErr w:type="gramEnd"/>
+      <w:r>
+        <w:t xml:space="preserve">\mu </w:t>
+      </w:r>
+      <w:proofErr w:type="gramStart"/>
+      <w:r>
+        <w:t>y}{</w:t>
+      </w:r>
+      <w:proofErr w:type="gramEnd"/>
+      <w:r>
+        <w:t>d_2^3} \</w:t>
+      </w:r>
+      <w:proofErr w:type="gramStart"/>
+      <w:r>
+        <w:t>; ,</w:t>
+      </w:r>
+      <w:proofErr w:type="gramEnd"/>
+      <w:r>
+        <w:t xml:space="preserve"> \]</w:t>
+      </w:r>
+    </w:p>
+    <w:p>
+      <w:pPr>
+        <w:pStyle w:val="NoSpacing"/>
+      </w:pPr>
+    </w:p>
+    <w:p>
+      <w:pPr>
+        <w:pStyle w:val="NoSpacing"/>
+      </w:pPr>
+      <w:r>
+        <w:t>and</w:t>
+      </w:r>
+    </w:p>
+    <w:p>
+      <w:pPr>
+        <w:pStyle w:val="NoSpacing"/>
+      </w:pPr>
+    </w:p>
+    <w:p>
+      <w:pPr>
+        <w:pStyle w:val="NoSpacing"/>
+      </w:pPr>
+      <w:proofErr w:type="gramStart"/>
+      <w:r>
+        <w:t>\[</w:t>
+      </w:r>
+      <w:proofErr w:type="gramEnd"/>
+      <w:r>
+        <w:t xml:space="preserve"> \frac{\</w:t>
+      </w:r>
+      <w:proofErr w:type="gramStart"/>
+      <w:r>
+        <w:t>partial}{</w:t>
+      </w:r>
+      <w:proofErr w:type="gramEnd"/>
+      <w:r>
+        <w:t xml:space="preserve">\partial z} {\tilde U} = -\frac{(1-\mu) </w:t>
+      </w:r>
+      <w:proofErr w:type="gramStart"/>
+      <w:r>
+        <w:t>z}{</w:t>
+      </w:r>
+      <w:proofErr w:type="gramEnd"/>
+      <w:r>
+        <w:t>d_1^3} - \</w:t>
+      </w:r>
+      <w:proofErr w:type="gramStart"/>
+      <w:r>
+        <w:t>frac{</w:t>
+      </w:r>
+      <w:proofErr w:type="gramEnd"/>
+      <w:r>
+        <w:t xml:space="preserve">\mu </w:t>
+      </w:r>
+      <w:proofErr w:type="gramStart"/>
+      <w:r>
+        <w:t>z}{</w:t>
+      </w:r>
+      <w:proofErr w:type="gramEnd"/>
+      <w:r>
+        <w:t>d_2^3} \</w:t>
+      </w:r>
+      <w:proofErr w:type="gramStart"/>
+      <w:r>
+        <w:t>; .</w:t>
+      </w:r>
+      <w:proofErr w:type="gramEnd"/>
+      <w:r>
+        <w:t xml:space="preserve"> \]</w:t>
+      </w:r>
+    </w:p>
+    <w:p>
+      <w:pPr>
+        <w:pStyle w:val="NoSpacing"/>
+      </w:pPr>
+    </w:p>
+    <w:p>
+      <w:pPr>
+        <w:pStyle w:val="NoSpacing"/>
+      </w:pPr>
+      <w:r>
+        <w:t xml:space="preserve">The next step is to recognize is to bring the centrifugal terms back to the right-hand side and to define </w:t>
+      </w:r>
+      <w:proofErr w:type="gramStart"/>
+      <w:r>
+        <w:t>a related</w:t>
+      </w:r>
+      <w:proofErr w:type="gramEnd"/>
+      <w:r>
+        <w:t xml:space="preserve"> potential</w:t>
+      </w:r>
+    </w:p>
+    <w:p>
+      <w:pPr>
+        <w:pStyle w:val="NoSpacing"/>
+      </w:pPr>
+    </w:p>
+    <w:p>
+      <w:pPr>
+        <w:pStyle w:val="NoSpacing"/>
+      </w:pPr>
+      <w:proofErr w:type="gramStart"/>
+      <w:r>
+        <w:t>\[</w:t>
+      </w:r>
+      <w:proofErr w:type="gramEnd"/>
+      <w:r>
+        <w:t xml:space="preserve"> U = \</w:t>
+      </w:r>
+      <w:proofErr w:type="gramStart"/>
+      <w:r>
+        <w:t>frac{</w:t>
+      </w:r>
+      <w:proofErr w:type="gramEnd"/>
+      <w:r>
+        <w:t xml:space="preserve">1}{2} </w:t>
+      </w:r>
+      <w:proofErr w:type="gramStart"/>
+      <w:r>
+        <w:t>( x</w:t>
+      </w:r>
+      <w:proofErr w:type="gramEnd"/>
+      <w:r>
+        <w:t>^2 + y^</w:t>
+      </w:r>
+      <w:proofErr w:type="gramStart"/>
+      <w:r>
+        <w:t>2 )</w:t>
+      </w:r>
+      <w:proofErr w:type="gramEnd"/>
+      <w:r>
+        <w:t xml:space="preserve"> + {\tilde </w:t>
+      </w:r>
+      <w:r>
+        <w:t>U</w:t>
+      </w:r>
+      <w:r>
+        <w:t>} = \</w:t>
+      </w:r>
+      <w:proofErr w:type="gramStart"/>
+      <w:r>
+        <w:t>frac{</w:t>
+      </w:r>
+      <w:proofErr w:type="gramEnd"/>
+      <w:r>
+        <w:t xml:space="preserve">1}{2} </w:t>
+      </w:r>
+      <w:proofErr w:type="gramStart"/>
+      <w:r>
+        <w:t>( x</w:t>
+      </w:r>
+      <w:proofErr w:type="gramEnd"/>
+      <w:r>
+        <w:t>^2 + y^</w:t>
+      </w:r>
+      <w:proofErr w:type="gramStart"/>
+      <w:r>
+        <w:t>2 )</w:t>
+      </w:r>
+      <w:proofErr w:type="gramEnd"/>
+      <w:r>
+        <w:t xml:space="preserve"> - \frac{1-\</w:t>
+      </w:r>
+      <w:proofErr w:type="gramStart"/>
+      <w:r>
+        <w:t>mu}{</w:t>
+      </w:r>
+      <w:proofErr w:type="gramEnd"/>
+      <w:r>
+        <w:t>d_1} - \frac{\</w:t>
+      </w:r>
+      <w:proofErr w:type="gramStart"/>
+      <w:r>
+        <w:t>mu}{</w:t>
+      </w:r>
+      <w:proofErr w:type="gramEnd"/>
+      <w:r>
+        <w:t xml:space="preserve">d_2} </w:t>
+      </w:r>
+      <w:proofErr w:type="gramStart"/>
+      <w:r>
+        <w:t>\;.</w:t>
+      </w:r>
+      <w:proofErr w:type="gramEnd"/>
+      <w:r>
+        <w:t xml:space="preserve"> \]</w:t>
+      </w:r>
+    </w:p>
+    <w:p>
+      <w:pPr>
+        <w:pStyle w:val="NoSpacing"/>
+      </w:pPr>
+    </w:p>
+    <w:p>
+      <w:pPr>
+        <w:pStyle w:val="NoSpacing"/>
+      </w:pPr>
+      <w:r>
+        <w:t>$U$ is known as the pseudo-potential of Jacobi, who first published its existence in 1836.</w:t>
+      </w:r>
+    </w:p>
+    <w:p>
+      <w:pPr>
+        <w:pStyle w:val="NoSpacing"/>
+      </w:pPr>
+    </w:p>
+    <w:p>
+      <w:pPr>
+        <w:pStyle w:val="NoSpacing"/>
+      </w:pPr>
+      <w:r>
         <w:lastRenderedPageBreak/>
-        <w:t xml:space="preserve">that result of the fact that (unlike velocities) accelerations and forces are vectors that `live' in the configuration space of the system. </w:t>
-      </w:r>
-    </w:p>
-    <w:p>
-      <w:pPr>
-        <w:pStyle w:val="NoSpacing"/>
-      </w:pPr>
-    </w:p>
-    <w:p>
-      <w:pPr>
-        <w:pStyle w:val="NoSpacing"/>
-      </w:pPr>
-      <w:r>
-        <w:t xml:space="preserve">From elementary classical mechanics, we know that gravitational forces are conservative and result from the taking a gradient of the </w:t>
-      </w:r>
-      <w:proofErr w:type="gramStart"/>
-      <w:r>
-        <w:t>a an</w:t>
-      </w:r>
-      <w:proofErr w:type="gramEnd"/>
-      <w:r>
-        <w:t xml:space="preserve"> appropriate potential. Therefore, we can expect that a similar potential, of the form</w:t>
-      </w:r>
-    </w:p>
-    <w:p>
-      <w:pPr>
-        <w:pStyle w:val="NoSpacing"/>
-      </w:pPr>
-    </w:p>
-    <w:p>
-      <w:pPr>
-        <w:pStyle w:val="NoSpacing"/>
-      </w:pPr>
-      <w:proofErr w:type="gramStart"/>
-      <w:r>
-        <w:t>\[</w:t>
-      </w:r>
-      <w:proofErr w:type="gramEnd"/>
-      <w:r>
-        <w:t xml:space="preserve"> {\tilde U} = -\frac{m_</w:t>
-      </w:r>
-      <w:proofErr w:type="gramStart"/>
-      <w:r>
-        <w:t>1}{</w:t>
-      </w:r>
-      <w:proofErr w:type="gramEnd"/>
-      <w:r>
-        <w:t>d_1} - \frac{m_</w:t>
-      </w:r>
-      <w:proofErr w:type="gramStart"/>
-      <w:r>
-        <w:t>2}{</w:t>
-      </w:r>
-      <w:proofErr w:type="gramEnd"/>
-      <w:r>
-        <w:t>d_2} = - \frac{1-\</w:t>
-      </w:r>
-      <w:proofErr w:type="gramStart"/>
-      <w:r>
-        <w:t>mu}{</w:t>
-      </w:r>
-      <w:proofErr w:type="gramEnd"/>
-      <w:r>
-        <w:t>d_1} - \frac{\</w:t>
-      </w:r>
-      <w:proofErr w:type="gramStart"/>
-      <w:r>
-        <w:t>mu}{</w:t>
-      </w:r>
-      <w:proofErr w:type="gramEnd"/>
-      <w:r>
-        <w:t>d_2} \; \]</w:t>
-      </w:r>
-    </w:p>
-    <w:p>
-      <w:pPr>
-        <w:pStyle w:val="NoSpacing"/>
-      </w:pPr>
-    </w:p>
-    <w:p>
-      <w:pPr>
-        <w:pStyle w:val="NoSpacing"/>
-      </w:pPr>
-      <w:r>
-        <w:t>should give rise to the right-hands sides by taking the appropriate derivatives.</w:t>
-      </w:r>
-    </w:p>
-    <w:p>
-      <w:pPr>
-        <w:pStyle w:val="NoSpacing"/>
-      </w:pPr>
-    </w:p>
-    <w:p>
-      <w:pPr>
-        <w:pStyle w:val="NoSpacing"/>
-      </w:pPr>
-      <w:r>
-        <w:t xml:space="preserve">We can </w:t>
-      </w:r>
-      <w:proofErr w:type="spellStart"/>
-      <w:r>
-        <w:t>verfiy</w:t>
-      </w:r>
-      <w:proofErr w:type="spellEnd"/>
-      <w:r>
-        <w:t xml:space="preserve"> this by relatively </w:t>
-      </w:r>
-      <w:proofErr w:type="gramStart"/>
-      <w:r>
-        <w:t>easily by</w:t>
-      </w:r>
-      <w:proofErr w:type="gramEnd"/>
-      <w:r>
-        <w:t xml:space="preserve"> differentiating $U$ (easier </w:t>
-      </w:r>
-      <w:proofErr w:type="gramStart"/>
-      <w:r>
-        <w:t>that</w:t>
-      </w:r>
-      <w:proofErr w:type="gramEnd"/>
-      <w:r>
-        <w:t xml:space="preserve"> integrating the right-hand sides) and by organizing the derivatives. Defining</w:t>
-      </w:r>
-    </w:p>
-    <w:p>
-      <w:pPr>
-        <w:pStyle w:val="NoSpacing"/>
-      </w:pPr>
-    </w:p>
-    <w:p>
-      <w:pPr>
-        <w:pStyle w:val="NoSpacing"/>
-      </w:pPr>
-      <w:proofErr w:type="gramStart"/>
-      <w:r>
-        <w:t>\[</w:t>
-      </w:r>
-      <w:proofErr w:type="gramEnd"/>
-      <w:r>
-        <w:t xml:space="preserve"> d = \</w:t>
-      </w:r>
-      <w:proofErr w:type="gramStart"/>
-      <w:r>
-        <w:t>sqrt{ (</w:t>
-      </w:r>
-      <w:proofErr w:type="gramEnd"/>
-      <w:r>
-        <w:t>x-x_</w:t>
-      </w:r>
-      <w:proofErr w:type="gramStart"/>
-      <w:r>
-        <w:t>0)^</w:t>
-      </w:r>
-      <w:proofErr w:type="gramEnd"/>
-      <w:r>
-        <w:t>2 + (y-y_</w:t>
-      </w:r>
-      <w:proofErr w:type="gramStart"/>
-      <w:r>
-        <w:t>0)^</w:t>
-      </w:r>
-      <w:proofErr w:type="gramEnd"/>
-      <w:r>
-        <w:t>2 + (z-z_</w:t>
-      </w:r>
-      <w:proofErr w:type="gramStart"/>
-      <w:r>
-        <w:t>0)^2 }</w:t>
-      </w:r>
-      <w:proofErr w:type="gramEnd"/>
-      <w:r>
-        <w:t xml:space="preserve"> \; \]</w:t>
-      </w:r>
-    </w:p>
-    <w:p>
-      <w:pPr>
-        <w:pStyle w:val="NoSpacing"/>
-      </w:pPr>
-    </w:p>
-    <w:p>
-      <w:pPr>
-        <w:pStyle w:val="NoSpacing"/>
-      </w:pPr>
-      <w:r>
-        <w:t xml:space="preserve">we can easily verify that </w:t>
-      </w:r>
-    </w:p>
-    <w:p>
-      <w:pPr>
-        <w:pStyle w:val="NoSpacing"/>
-      </w:pPr>
-    </w:p>
-    <w:p>
-      <w:pPr>
-        <w:pStyle w:val="NoSpacing"/>
-      </w:pPr>
-      <w:proofErr w:type="gramStart"/>
-      <w:r>
-        <w:t>\[</w:t>
-      </w:r>
-      <w:proofErr w:type="gramEnd"/>
-      <w:r>
-        <w:t xml:space="preserve"> \frac{\</w:t>
-      </w:r>
-      <w:proofErr w:type="gramStart"/>
-      <w:r>
-        <w:t>partial}{</w:t>
-      </w:r>
-      <w:proofErr w:type="gramEnd"/>
-      <w:r>
-        <w:t>\partial x} d= \frac{x-x_</w:t>
-      </w:r>
-      <w:proofErr w:type="gramStart"/>
-      <w:r>
-        <w:t>0}{</w:t>
-      </w:r>
-      <w:proofErr w:type="gramEnd"/>
-      <w:r>
-        <w:t>d} \; \]</w:t>
-      </w:r>
-    </w:p>
-    <w:p>
-      <w:pPr>
-        <w:pStyle w:val="NoSpacing"/>
-      </w:pPr>
-    </w:p>
-    <w:p>
-      <w:pPr>
-        <w:pStyle w:val="NoSpacing"/>
-      </w:pPr>
-      <w:r>
-        <w:t>and</w:t>
-      </w:r>
-    </w:p>
-    <w:p>
-      <w:pPr>
-        <w:pStyle w:val="NoSpacing"/>
-      </w:pPr>
-    </w:p>
-    <w:p>
-      <w:pPr>
-        <w:pStyle w:val="NoSpacing"/>
-      </w:pPr>
-      <w:proofErr w:type="gramStart"/>
-      <w:r>
-        <w:t>\[</w:t>
-      </w:r>
-      <w:proofErr w:type="gramEnd"/>
-      <w:r>
-        <w:t xml:space="preserve"> \frac{\</w:t>
-      </w:r>
-      <w:proofErr w:type="gramStart"/>
-      <w:r>
-        <w:t>partial}{</w:t>
-      </w:r>
-      <w:proofErr w:type="gramEnd"/>
-      <w:r>
-        <w:t>\partial x} \frac{1}{d} = -\frac{</w:t>
-      </w:r>
-      <w:proofErr w:type="gramStart"/>
-      <w:r>
-        <w:t>1}{</w:t>
-      </w:r>
-      <w:proofErr w:type="gramEnd"/>
-      <w:r>
-        <w:t>d^2} \frac{\</w:t>
-      </w:r>
-      <w:proofErr w:type="gramStart"/>
-      <w:r>
-        <w:t>partial}{</w:t>
-      </w:r>
-      <w:proofErr w:type="gramEnd"/>
-      <w:r>
-        <w:t>\partial x} d= - \frac{x-x_</w:t>
-      </w:r>
-      <w:proofErr w:type="gramStart"/>
-      <w:r>
-        <w:t>0}{</w:t>
-      </w:r>
-      <w:proofErr w:type="gramEnd"/>
-      <w:r>
-        <w:t>d^3} \</w:t>
-      </w:r>
-      <w:proofErr w:type="gramStart"/>
-      <w:r>
-        <w:t>; ,</w:t>
-      </w:r>
-      <w:proofErr w:type="gramEnd"/>
-      <w:r>
-        <w:t xml:space="preserve"> \]</w:t>
-      </w:r>
-    </w:p>
-    <w:p>
-      <w:pPr>
-        <w:pStyle w:val="NoSpacing"/>
-      </w:pPr>
-    </w:p>
-    <w:p>
-      <w:pPr>
-        <w:pStyle w:val="NoSpacing"/>
-      </w:pPr>
-      <w:r>
-        <w:t>with analogous expressions for the derivatives with respect to $y$ and $z$.</w:t>
-      </w:r>
-    </w:p>
-    <w:p>
-      <w:pPr>
-        <w:pStyle w:val="NoSpacing"/>
-      </w:pPr>
-    </w:p>
-    <w:p>
-      <w:pPr>
-        <w:pStyle w:val="NoSpacing"/>
-      </w:pPr>
-      <w:r>
-        <w:t>Following this program, we see that</w:t>
-      </w:r>
-    </w:p>
-    <w:p>
-      <w:pPr>
-        <w:pStyle w:val="NoSpacing"/>
-      </w:pPr>
-    </w:p>
-    <w:p>
-      <w:pPr>
-        <w:pStyle w:val="NoSpacing"/>
-      </w:pPr>
-      <w:proofErr w:type="gramStart"/>
-      <w:r>
-        <w:t>\[</w:t>
-      </w:r>
-      <w:proofErr w:type="gramEnd"/>
-      <w:r>
-        <w:t xml:space="preserve"> \frac{\</w:t>
-      </w:r>
-      <w:proofErr w:type="gramStart"/>
-      <w:r>
-        <w:t>partial}{</w:t>
-      </w:r>
-      <w:proofErr w:type="gramEnd"/>
-      <w:r>
-        <w:t>\partial x} {\tilde U} = -\frac{(1-\</w:t>
-      </w:r>
-      <w:proofErr w:type="gramStart"/>
-      <w:r>
-        <w:t>mu)(</w:t>
-      </w:r>
-      <w:proofErr w:type="gramEnd"/>
-      <w:r>
-        <w:t>x+\mu</w:t>
-      </w:r>
-      <w:proofErr w:type="gramStart"/>
-      <w:r>
-        <w:t>)}{</w:t>
-      </w:r>
-      <w:proofErr w:type="gramEnd"/>
-      <w:r>
-        <w:t>d_1^3} - \frac{\mu(x-1+\mu</w:t>
-      </w:r>
-      <w:proofErr w:type="gramStart"/>
-      <w:r>
-        <w:t>)}{</w:t>
-      </w:r>
-      <w:proofErr w:type="gramEnd"/>
-      <w:r>
-        <w:t>d_2^3} \</w:t>
-      </w:r>
-      <w:proofErr w:type="gramStart"/>
-      <w:r>
-        <w:t>; ,</w:t>
-      </w:r>
-      <w:proofErr w:type="gramEnd"/>
-      <w:r>
-        <w:t xml:space="preserve"> \]</w:t>
-      </w:r>
-    </w:p>
-    <w:p>
-      <w:pPr>
-        <w:pStyle w:val="NoSpacing"/>
-      </w:pPr>
-    </w:p>
-    <w:p>
-      <w:pPr>
-        <w:pStyle w:val="NoSpacing"/>
-      </w:pPr>
-      <w:proofErr w:type="gramStart"/>
-      <w:r>
-        <w:t>\[</w:t>
-      </w:r>
-      <w:proofErr w:type="gramEnd"/>
-      <w:r>
-        <w:t xml:space="preserve"> \frac{\</w:t>
-      </w:r>
-      <w:proofErr w:type="gramStart"/>
-      <w:r>
-        <w:t>partial}{</w:t>
-      </w:r>
-      <w:proofErr w:type="gramEnd"/>
-      <w:r>
-        <w:t xml:space="preserve">\partial y} {\tilde U} = -\frac{(1-\mu) </w:t>
-      </w:r>
-      <w:proofErr w:type="gramStart"/>
-      <w:r>
-        <w:t>y}{</w:t>
-      </w:r>
-      <w:proofErr w:type="gramEnd"/>
-      <w:r>
-        <w:t>d_1^3} - \</w:t>
-      </w:r>
-      <w:proofErr w:type="gramStart"/>
-      <w:r>
-        <w:t>frac{</w:t>
-      </w:r>
-      <w:proofErr w:type="gramEnd"/>
-      <w:r>
-        <w:t xml:space="preserve">\mu </w:t>
-      </w:r>
-      <w:proofErr w:type="gramStart"/>
-      <w:r>
-        <w:t>y}{</w:t>
-      </w:r>
-      <w:proofErr w:type="gramEnd"/>
-      <w:r>
-        <w:t>d_2^3} \</w:t>
-      </w:r>
-      <w:proofErr w:type="gramStart"/>
-      <w:r>
-        <w:t>; ,</w:t>
-      </w:r>
-      <w:proofErr w:type="gramEnd"/>
-      <w:r>
-        <w:t xml:space="preserve"> \]</w:t>
-      </w:r>
-    </w:p>
-    <w:p>
-      <w:pPr>
-        <w:pStyle w:val="NoSpacing"/>
-      </w:pPr>
-    </w:p>
-    <w:p>
-      <w:pPr>
-        <w:pStyle w:val="NoSpacing"/>
-      </w:pPr>
-      <w:r>
-        <w:t>and</w:t>
-      </w:r>
-    </w:p>
-    <w:p>
-      <w:pPr>
-        <w:pStyle w:val="NoSpacing"/>
-      </w:pPr>
-    </w:p>
-    <w:p>
-      <w:pPr>
-        <w:pStyle w:val="NoSpacing"/>
-      </w:pPr>
-      <w:proofErr w:type="gramStart"/>
-      <w:r>
-        <w:t>\[</w:t>
-      </w:r>
-      <w:proofErr w:type="gramEnd"/>
-      <w:r>
-        <w:t xml:space="preserve"> \frac{\</w:t>
-      </w:r>
-      <w:proofErr w:type="gramStart"/>
-      <w:r>
-        <w:t>partial}{</w:t>
-      </w:r>
-      <w:proofErr w:type="gramEnd"/>
-      <w:r>
-        <w:t xml:space="preserve">\partial z} {\tilde U} = -\frac{(1-\mu) </w:t>
-      </w:r>
-      <w:proofErr w:type="gramStart"/>
-      <w:r>
-        <w:t>z}{</w:t>
-      </w:r>
-      <w:proofErr w:type="gramEnd"/>
-      <w:r>
-        <w:t>d_1^3} - \</w:t>
-      </w:r>
-      <w:proofErr w:type="gramStart"/>
-      <w:r>
-        <w:t>frac{</w:t>
-      </w:r>
-      <w:proofErr w:type="gramEnd"/>
-      <w:r>
-        <w:t xml:space="preserve">\mu </w:t>
-      </w:r>
-      <w:proofErr w:type="gramStart"/>
-      <w:r>
-        <w:t>z}{</w:t>
-      </w:r>
-      <w:proofErr w:type="gramEnd"/>
-      <w:r>
-        <w:t>d_2^3} \</w:t>
-      </w:r>
-      <w:proofErr w:type="gramStart"/>
-      <w:r>
-        <w:t>; .</w:t>
-      </w:r>
-      <w:proofErr w:type="gramEnd"/>
-      <w:r>
-        <w:t xml:space="preserve"> \]</w:t>
-      </w:r>
-    </w:p>
-    <w:p>
-      <w:pPr>
-        <w:pStyle w:val="NoSpacing"/>
-      </w:pPr>
-    </w:p>
-    <w:p>
-      <w:pPr>
-        <w:pStyle w:val="NoSpacing"/>
-      </w:pPr>
-      <w:r>
-        <w:t xml:space="preserve">The next step is to recognize is to bring the centrifugal terms back to the right-hand side and to define </w:t>
-      </w:r>
-      <w:proofErr w:type="gramStart"/>
-      <w:r>
-        <w:t>a related</w:t>
-      </w:r>
-      <w:proofErr w:type="gramEnd"/>
-      <w:r>
-        <w:t xml:space="preserve"> potential</w:t>
-      </w:r>
-    </w:p>
-    <w:p>
-      <w:pPr>
-        <w:pStyle w:val="NoSpacing"/>
-      </w:pPr>
-    </w:p>
-    <w:p>
-      <w:pPr>
-        <w:pStyle w:val="NoSpacing"/>
-      </w:pPr>
-      <w:proofErr w:type="gramStart"/>
-      <w:r>
-        <w:t>\[</w:t>
-      </w:r>
-      <w:proofErr w:type="gramEnd"/>
-      <w:r>
-        <w:t xml:space="preserve"> U = \</w:t>
-      </w:r>
-      <w:proofErr w:type="gramStart"/>
-      <w:r>
-        <w:t>frac{</w:t>
-      </w:r>
-      <w:proofErr w:type="gramEnd"/>
-      <w:r>
-        <w:t xml:space="preserve">1}{2} </w:t>
-      </w:r>
-      <w:proofErr w:type="gramStart"/>
-      <w:r>
-        <w:t>( x</w:t>
-      </w:r>
-      <w:proofErr w:type="gramEnd"/>
-      <w:r>
-        <w:t>^2 + y^</w:t>
-      </w:r>
-      <w:proofErr w:type="gramStart"/>
-      <w:r>
-        <w:t>2 )</w:t>
-      </w:r>
-      <w:proofErr w:type="gramEnd"/>
-      <w:r>
-        <w:t xml:space="preserve"> + {\tilde u} = \</w:t>
-      </w:r>
-      <w:proofErr w:type="gramStart"/>
-      <w:r>
-        <w:t>frac{</w:t>
-      </w:r>
-      <w:proofErr w:type="gramEnd"/>
-      <w:r>
-        <w:t xml:space="preserve">1}{2} </w:t>
-      </w:r>
-      <w:proofErr w:type="gramStart"/>
-      <w:r>
-        <w:t>( x</w:t>
-      </w:r>
-      <w:proofErr w:type="gramEnd"/>
-      <w:r>
-        <w:t>^2 + y^</w:t>
-      </w:r>
-      <w:proofErr w:type="gramStart"/>
-      <w:r>
-        <w:t>2 )</w:t>
-      </w:r>
-      <w:proofErr w:type="gramEnd"/>
-      <w:r>
-        <w:t xml:space="preserve"> - \frac{1-\</w:t>
-      </w:r>
-      <w:proofErr w:type="gramStart"/>
-      <w:r>
-        <w:t>mu}{</w:t>
-      </w:r>
-      <w:proofErr w:type="gramEnd"/>
-      <w:r>
-        <w:t>d_1} - \frac{\</w:t>
-      </w:r>
-      <w:proofErr w:type="gramStart"/>
-      <w:r>
-        <w:t>mu}{</w:t>
-      </w:r>
-      <w:proofErr w:type="gramEnd"/>
-      <w:r>
-        <w:t xml:space="preserve">d_2} </w:t>
-      </w:r>
-      <w:proofErr w:type="gramStart"/>
-      <w:r>
-        <w:t>\;.</w:t>
-      </w:r>
-      <w:proofErr w:type="gramEnd"/>
-      <w:r>
-        <w:t xml:space="preserve"> \]</w:t>
-      </w:r>
-    </w:p>
-    <w:p>
-      <w:pPr>
-        <w:pStyle w:val="NoSpacing"/>
-      </w:pPr>
-    </w:p>
-    <w:p>
-      <w:pPr>
-        <w:pStyle w:val="NoSpacing"/>
-      </w:pPr>
-      <w:r>
-        <w:lastRenderedPageBreak/>
-        <w:t>$U$ is known as the pseudo-potential of Jacobi, who first published its existence in 1836.</w:t>
-      </w:r>
-    </w:p>
-    <w:p>
-      <w:pPr>
-        <w:pStyle w:val="NoSpacing"/>
-      </w:pPr>
-    </w:p>
-    <w:p>
-      <w:pPr>
-        <w:pStyle w:val="NoSpacing"/>
-      </w:pPr>
-      <w:r>
         <w:t>The equations of motion now take on the compact form (with $\</w:t>
       </w:r>
       <w:proofErr w:type="spellStart"/>
@@ -1749,15 +1703,216 @@
       </w:r>
       <w:proofErr w:type="gramEnd"/>
       <w:r>
+        <w:t xml:space="preserve">\dot </w:t>
+      </w:r>
+      <w:proofErr w:type="gramStart"/>
+      <w:r>
+        <w:t>x}^</w:t>
+      </w:r>
+      <w:proofErr w:type="gramEnd"/>
+      <w:r>
+        <w:t xml:space="preserve">2 + {\dot </w:t>
+      </w:r>
+      <w:proofErr w:type="gramStart"/>
+      <w:r>
+        <w:t>y}^</w:t>
+      </w:r>
+      <w:proofErr w:type="gramEnd"/>
+      <w:r>
+        <w:t xml:space="preserve">2 + {\dot </w:t>
+      </w:r>
+      <w:proofErr w:type="gramStart"/>
+      <w:r>
+        <w:t>z}^</w:t>
+      </w:r>
+      <w:proofErr w:type="gramEnd"/>
+      <w:r>
+        <w:t xml:space="preserve">2 \right) = \frac{d}{dt} </w:t>
+      </w:r>
+      <w:r>
+        <w:t>U \</w:t>
+      </w:r>
+      <w:proofErr w:type="gramStart"/>
+      <w:r>
+        <w:t>; .</w:t>
+      </w:r>
+      <w:proofErr w:type="gramEnd"/>
+      <w:r>
+        <w:t>\]</w:t>
+      </w:r>
+    </w:p>
+    <w:p>
+      <w:pPr>
+        <w:pStyle w:val="NoSpacing"/>
+      </w:pPr>
+    </w:p>
+    <w:p>
+      <w:pPr>
+        <w:pStyle w:val="NoSpacing"/>
+      </w:pPr>
+      <w:r>
+        <w:t>Collecting the terms on the left-hand side and carrying out the integral gives</w:t>
+      </w:r>
+    </w:p>
+    <w:p>
+      <w:pPr>
+        <w:pStyle w:val="NoSpacing"/>
+      </w:pPr>
+    </w:p>
+    <w:p>
+      <w:pPr>
+        <w:pStyle w:val="NoSpacing"/>
+      </w:pPr>
+      <w:proofErr w:type="gramStart"/>
+      <w:r>
+        <w:t>\[</w:t>
+      </w:r>
+      <w:proofErr w:type="gramEnd"/>
+      <w:r>
+        <w:t xml:space="preserve"> \</w:t>
+      </w:r>
+      <w:proofErr w:type="gramStart"/>
+      <w:r>
+        <w:t>frac{</w:t>
+      </w:r>
+      <w:proofErr w:type="gramEnd"/>
+      <w:r>
+        <w:t>1}{2} \</w:t>
+      </w:r>
+      <w:proofErr w:type="gramStart"/>
+      <w:r>
+        <w:t xml:space="preserve">left(  </w:t>
+      </w:r>
+      <w:proofErr w:type="gramEnd"/>
+      <w:r>
+        <w:t xml:space="preserve">{\dot </w:t>
+      </w:r>
+      <w:proofErr w:type="gramStart"/>
+      <w:r>
+        <w:t>x}^</w:t>
+      </w:r>
+      <w:proofErr w:type="gramEnd"/>
+      <w:r>
+        <w:t xml:space="preserve">2 + {\dot </w:t>
+      </w:r>
+      <w:proofErr w:type="gramStart"/>
+      <w:r>
+        <w:t>y}^</w:t>
+      </w:r>
+      <w:proofErr w:type="gramEnd"/>
+      <w:r>
+        <w:t xml:space="preserve">2 + {\dot </w:t>
+      </w:r>
+      <w:proofErr w:type="gramStart"/>
+      <w:r>
+        <w:t>z}^</w:t>
+      </w:r>
+      <w:proofErr w:type="gramEnd"/>
+      <w:r>
+        <w:t xml:space="preserve">2 \right)-U = </w:t>
+      </w:r>
+      <w:r>
+        <w:t>constant \</w:t>
+      </w:r>
+      <w:proofErr w:type="gramStart"/>
+      <w:r>
+        <w:t>; .</w:t>
+      </w:r>
+      <w:proofErr w:type="gramEnd"/>
+      <w:r>
+        <w:t xml:space="preserve"> \]</w:t>
+      </w:r>
+    </w:p>
+    <w:p>
+      <w:pPr>
+        <w:pStyle w:val="NoSpacing"/>
+      </w:pPr>
+    </w:p>
+    <w:p>
+      <w:pPr>
+        <w:pStyle w:val="NoSpacing"/>
+      </w:pPr>
+      <w:r>
+        <w:t>The form of the constant differs somewhat from book to book.  We will depart from A. E. Roy here by expressing that constant as $</w:t>
+      </w:r>
+      <w:r>
+        <w:t>(</w:t>
+      </w:r>
+      <w:r>
+        <w:t>1/2</w:t>
+      </w:r>
+      <w:r>
+        <w:t>)</w:t>
+      </w:r>
+      <w:r>
+        <w:t xml:space="preserve"> </w:t>
+      </w:r>
+      <w:r>
+        <w:t>C_J$</w:t>
+      </w:r>
+      <w:r>
+        <w:t xml:space="preserve"> so that</w:t>
+      </w:r>
+    </w:p>
+    <w:p>
+      <w:pPr>
+        <w:pStyle w:val="NoSpacing"/>
+      </w:pPr>
+    </w:p>
+    <w:p>
+      <w:pPr>
+        <w:pStyle w:val="NoSpacing"/>
+      </w:pPr>
+      <w:proofErr w:type="gramStart"/>
+      <w:r>
+        <w:t>\[</w:t>
+      </w:r>
+      <w:proofErr w:type="gramEnd"/>
+      <w:r>
+        <w:t xml:space="preserve"> C_</w:t>
+      </w:r>
+      <w:proofErr w:type="gramStart"/>
+      <w:r>
+        <w:t>J  =</w:t>
+      </w:r>
+      <w:proofErr w:type="gramEnd"/>
+      <w:r>
+        <w:t xml:space="preserve"> </w:t>
+      </w:r>
+      <w:r>
+        <w:t>2 U – v^2 \</w:t>
+      </w:r>
+      <w:proofErr w:type="gramStart"/>
+      <w:r>
+        <w:t>; ,</w:t>
+      </w:r>
+      <w:proofErr w:type="gramEnd"/>
+      <w:r>
+        <w:t xml:space="preserve"> \]</w:t>
+      </w:r>
+    </w:p>
+    <w:p>
+      <w:pPr>
+        <w:pStyle w:val="NoSpacing"/>
+      </w:pPr>
+    </w:p>
+    <w:p>
+      <w:pPr>
+        <w:pStyle w:val="NoSpacing"/>
+      </w:pPr>
+      <w:r>
+        <w:t xml:space="preserve">where $v^2 </w:t>
+      </w:r>
+      <w:proofErr w:type="gramStart"/>
+      <w:r>
+        <w:t>= {</w:t>
+      </w:r>
+      <w:r>
         <w:t>\</w:t>
       </w:r>
-      <w:proofErr w:type="spellStart"/>
-      <w:r>
-        <w:t>ddot</w:t>
-      </w:r>
-      <w:proofErr w:type="spellEnd"/>
-      <w:r>
-        <w:t xml:space="preserve"> </w:t>
+      <w:proofErr w:type="gramEnd"/>
+      <w:r>
+        <w:t xml:space="preserve">dot </w:t>
       </w:r>
       <w:proofErr w:type="gramStart"/>
       <w:r>
@@ -1765,15 +1920,18 @@
       </w:r>
       <w:proofErr w:type="gramEnd"/>
       <w:r>
-        <w:t>2 + {\</w:t>
-      </w:r>
-      <w:proofErr w:type="spellStart"/>
-      <w:r>
-        <w:t>ddot</w:t>
-      </w:r>
-      <w:proofErr w:type="spellEnd"/>
-      <w:r>
-        <w:t xml:space="preserve"> </w:t>
+        <w:t xml:space="preserve">2 </w:t>
+      </w:r>
+      <w:proofErr w:type="gramStart"/>
+      <w:r>
+        <w:t>+{</w:t>
+      </w:r>
+      <w:proofErr w:type="gramEnd"/>
+      <w:r>
+        <w:t>\</w:t>
+      </w:r>
+      <w:r>
+        <w:t xml:space="preserve">dot </w:t>
       </w:r>
       <w:proofErr w:type="gramStart"/>
       <w:r>
@@ -1781,15 +1939,18 @@
       </w:r>
       <w:proofErr w:type="gramEnd"/>
       <w:r>
-        <w:t>2 + {\</w:t>
-      </w:r>
-      <w:proofErr w:type="spellStart"/>
-      <w:r>
-        <w:t>ddot</w:t>
-      </w:r>
-      <w:proofErr w:type="spellEnd"/>
-      <w:r>
-        <w:t xml:space="preserve"> </w:t>
+        <w:t xml:space="preserve">2 </w:t>
+      </w:r>
+      <w:proofErr w:type="gramStart"/>
+      <w:r>
+        <w:t>+{</w:t>
+      </w:r>
+      <w:proofErr w:type="gramEnd"/>
+      <w:r>
+        <w:t>\</w:t>
+      </w:r>
+      <w:r>
+        <w:t xml:space="preserve">dot </w:t>
       </w:r>
       <w:proofErr w:type="gramStart"/>
       <w:r>
@@ -1797,192 +1958,19 @@
       </w:r>
       <w:proofErr w:type="gramEnd"/>
       <w:r>
-        <w:t xml:space="preserve">2 \right) = \frac{d}{dt} </w:t>
-      </w:r>
-      <w:r>
-        <w:t>U \</w:t>
-      </w:r>
-      <w:proofErr w:type="gramStart"/>
-      <w:r>
-        <w:t>; .</w:t>
-      </w:r>
-      <w:proofErr w:type="gramEnd"/>
-      <w:r>
-        <w:t>\]</w:t>
-      </w:r>
-    </w:p>
-    <w:p>
-      <w:pPr>
-        <w:pStyle w:val="NoSpacing"/>
-      </w:pPr>
-    </w:p>
-    <w:p>
-      <w:pPr>
-        <w:pStyle w:val="NoSpacing"/>
-      </w:pPr>
-      <w:r>
-        <w:t>Collecting the terms on the left-hand side and carrying out the integral gives</w:t>
-      </w:r>
-    </w:p>
-    <w:p>
-      <w:pPr>
-        <w:pStyle w:val="NoSpacing"/>
-      </w:pPr>
-    </w:p>
-    <w:p>
-      <w:pPr>
-        <w:pStyle w:val="NoSpacing"/>
-      </w:pPr>
-      <w:proofErr w:type="gramStart"/>
-      <w:r>
-        <w:t>\[</w:t>
-      </w:r>
-      <w:proofErr w:type="gramEnd"/>
-      <w:r>
-        <w:t xml:space="preserve"> \</w:t>
-      </w:r>
-      <w:proofErr w:type="gramStart"/>
-      <w:r>
-        <w:t>frac{</w:t>
-      </w:r>
-      <w:proofErr w:type="gramEnd"/>
-      <w:r>
-        <w:t>1}{2} \</w:t>
-      </w:r>
-      <w:proofErr w:type="gramStart"/>
-      <w:r>
-        <w:t>left( (</w:t>
-      </w:r>
-      <w:proofErr w:type="gramEnd"/>
-      <w:r>
-        <w:t xml:space="preserve"> {\</w:t>
-      </w:r>
-      <w:proofErr w:type="spellStart"/>
-      <w:r>
-        <w:t>ddot</w:t>
-      </w:r>
-      <w:proofErr w:type="spellEnd"/>
-      <w:r>
-        <w:t xml:space="preserve"> </w:t>
-      </w:r>
-      <w:proofErr w:type="gramStart"/>
-      <w:r>
-        <w:t>x}^</w:t>
-      </w:r>
-      <w:proofErr w:type="gramEnd"/>
-      <w:r>
-        <w:t>2 + {\</w:t>
-      </w:r>
-      <w:proofErr w:type="spellStart"/>
-      <w:r>
-        <w:t>ddot</w:t>
-      </w:r>
-      <w:proofErr w:type="spellEnd"/>
-      <w:r>
-        <w:t xml:space="preserve"> </w:t>
-      </w:r>
-      <w:proofErr w:type="gramStart"/>
-      <w:r>
-        <w:t>y}^</w:t>
-      </w:r>
-      <w:proofErr w:type="gramEnd"/>
-      <w:r>
-        <w:t>2 + {\</w:t>
-      </w:r>
-      <w:proofErr w:type="spellStart"/>
-      <w:r>
-        <w:t>ddot</w:t>
-      </w:r>
-      <w:proofErr w:type="spellEnd"/>
-      <w:r>
-        <w:t xml:space="preserve"> </w:t>
-      </w:r>
-      <w:proofErr w:type="gramStart"/>
-      <w:r>
-        <w:t>z}^</w:t>
-      </w:r>
-      <w:proofErr w:type="gramEnd"/>
-      <w:r>
-        <w:t xml:space="preserve">2 \right)-U = </w:t>
-      </w:r>
-      <w:r>
-        <w:t>constant \</w:t>
-      </w:r>
-      <w:proofErr w:type="gramStart"/>
-      <w:r>
-        <w:t>; .</w:t>
-      </w:r>
-      <w:proofErr w:type="gramEnd"/>
-      <w:r>
-        <w:t xml:space="preserve"> \]</w:t>
-      </w:r>
-    </w:p>
-    <w:p>
-      <w:pPr>
-        <w:pStyle w:val="NoSpacing"/>
-      </w:pPr>
-    </w:p>
-    <w:p>
-      <w:pPr>
-        <w:pStyle w:val="NoSpacing"/>
-      </w:pPr>
-      <w:r>
-        <w:t>The form of the constant differs somewhat from book to book.  We will depart from A. E. Roy here by expressing that constant as $</w:t>
-      </w:r>
-      <w:r>
-        <w:t>(</w:t>
-      </w:r>
-      <w:r>
-        <w:t>1/2</w:t>
+        <w:t>2$</w:t>
+      </w:r>
+      <w:r>
+        <w:t xml:space="preserve">.  </w:t>
+      </w:r>
+      <w:r>
+        <w:t>$C_J$ is universally referred to as Jacobi’s constant (even if the form of it isn't always the same</w:t>
       </w:r>
       <w:r>
         <w:t>)</w:t>
       </w:r>
       <w:r>
-        <w:t xml:space="preserve"> </w:t>
-      </w:r>
-      <w:r>
-        <w:t>C_J$</w:t>
-      </w:r>
-      <w:r>
-        <w:t xml:space="preserve"> so that</w:t>
-      </w:r>
-    </w:p>
-    <w:p>
-      <w:pPr>
-        <w:pStyle w:val="NoSpacing"/>
-      </w:pPr>
-    </w:p>
-    <w:p>
-      <w:pPr>
-        <w:pStyle w:val="NoSpacing"/>
-      </w:pPr>
-      <w:proofErr w:type="gramStart"/>
-      <w:r>
-        <w:t>\[</w:t>
-      </w:r>
-      <w:proofErr w:type="gramEnd"/>
-      <w:r>
-        <w:t xml:space="preserve"> C_</w:t>
-      </w:r>
-      <w:proofErr w:type="gramStart"/>
-      <w:r>
-        <w:t>J  =</w:t>
-      </w:r>
-      <w:proofErr w:type="gramEnd"/>
-      <w:r>
-        <w:t xml:space="preserve"> </w:t>
-      </w:r>
-      <w:r>
-        <w:t>2 U – v^2 \</w:t>
-      </w:r>
-      <w:proofErr w:type="gramStart"/>
-      <w:r>
-        <w:t>; ,</w:t>
-      </w:r>
-      <w:proofErr w:type="gramEnd"/>
-      <w:r>
-        <w:t xml:space="preserve"> \]</w:t>
+        <w:t>.</w:t>
       </w:r>
     </w:p>
     <w:p>
@@ -1996,100 +1984,6 @@
       </w:pPr>
       <w:r>
         <w:lastRenderedPageBreak/>
-        <w:t xml:space="preserve">where $v^2 </w:t>
-      </w:r>
-      <w:proofErr w:type="gramStart"/>
-      <w:r>
-        <w:t>= {</w:t>
-      </w:r>
-      <w:r>
-        <w:t>\</w:t>
-      </w:r>
-      <w:proofErr w:type="spellStart"/>
-      <w:proofErr w:type="gramEnd"/>
-      <w:r>
-        <w:t>ddot</w:t>
-      </w:r>
-      <w:proofErr w:type="spellEnd"/>
-      <w:r>
-        <w:t xml:space="preserve"> </w:t>
-      </w:r>
-      <w:proofErr w:type="gramStart"/>
-      <w:r>
-        <w:t>x}^</w:t>
-      </w:r>
-      <w:proofErr w:type="gramEnd"/>
-      <w:r>
-        <w:t xml:space="preserve">2 </w:t>
-      </w:r>
-      <w:proofErr w:type="gramStart"/>
-      <w:r>
-        <w:t>+{</w:t>
-      </w:r>
-      <w:proofErr w:type="gramEnd"/>
-      <w:r>
-        <w:t>\</w:t>
-      </w:r>
-      <w:proofErr w:type="spellStart"/>
-      <w:r>
-        <w:t>ddot</w:t>
-      </w:r>
-      <w:proofErr w:type="spellEnd"/>
-      <w:r>
-        <w:t xml:space="preserve"> </w:t>
-      </w:r>
-      <w:proofErr w:type="gramStart"/>
-      <w:r>
-        <w:t>y}^</w:t>
-      </w:r>
-      <w:proofErr w:type="gramEnd"/>
-      <w:r>
-        <w:t xml:space="preserve">2 </w:t>
-      </w:r>
-      <w:proofErr w:type="gramStart"/>
-      <w:r>
-        <w:t>+{</w:t>
-      </w:r>
-      <w:proofErr w:type="gramEnd"/>
-      <w:r>
-        <w:t>\</w:t>
-      </w:r>
-      <w:proofErr w:type="spellStart"/>
-      <w:r>
-        <w:t>ddot</w:t>
-      </w:r>
-      <w:proofErr w:type="spellEnd"/>
-      <w:r>
-        <w:t xml:space="preserve"> </w:t>
-      </w:r>
-      <w:proofErr w:type="gramStart"/>
-      <w:r>
-        <w:t>z}^</w:t>
-      </w:r>
-      <w:proofErr w:type="gramEnd"/>
-      <w:r>
-        <w:t>2$</w:t>
-      </w:r>
-      <w:r>
-        <w:t xml:space="preserve">.  </w:t>
-      </w:r>
-      <w:r>
-        <w:t>$C_J$ is universally referred to as Jacobi’s constant (even if the form of it isn't always the same</w:t>
-      </w:r>
-      <w:r>
-        <w:t>.</w:t>
-      </w:r>
-    </w:p>
-    <w:p>
-      <w:pPr>
-        <w:pStyle w:val="NoSpacing"/>
-      </w:pPr>
-    </w:p>
-    <w:p>
-      <w:pPr>
-        <w:pStyle w:val="NoSpacing"/>
-      </w:pPr>
-      <w:r>
         <w:t xml:space="preserve">Next month, we’ll see how the presence of this </w:t>
       </w:r>
       <w:r>
@@ -2113,13 +2007,23 @@
       <w:r>
         <w:t xml:space="preserve">is </w:t>
       </w:r>
-      <w:proofErr w:type="gramStart"/>
-      <w:r>
-        <w:t>possible</w:t>
-      </w:r>
-      <w:proofErr w:type="gramEnd"/>
-      <w:r>
-        <w:t xml:space="preserve"> based on the geometry of the defining equation for $C_J$ above</w:t>
+      <w:r>
+        <w:t xml:space="preserve">made </w:t>
+      </w:r>
+      <w:r>
+        <w:t xml:space="preserve">possible </w:t>
+      </w:r>
+      <w:r>
+        <w:t xml:space="preserve">by </w:t>
+      </w:r>
+      <w:r>
+        <w:t>examining</w:t>
+      </w:r>
+      <w:r>
+        <w:t xml:space="preserve"> the </w:t>
+      </w:r>
+      <w:r>
+        <w:t>geometry of the defining equation for $C_J$ above</w:t>
       </w:r>
       <w:r>
         <w:t>.</w:t>
@@ -2751,7 +2655,6 @@
   <w:style w:type="character" w:default="1" w:styleId="DefaultParagraphFont">
     <w:name w:val="Default Paragraph Font"/>
     <w:uiPriority w:val="1"/>
-    <w:semiHidden/>
     <w:unhideWhenUsed/>
   </w:style>
   <w:style w:type="table" w:default="1" w:styleId="TableNormal">
@@ -3073,6 +2976,29 @@
     <w:pPr>
       <w:spacing w:after="0" w:line="240" w:lineRule="auto"/>
     </w:pPr>
+  </w:style>
+  <w:style w:type="character" w:styleId="Hyperlink">
+    <w:name w:val="Hyperlink"/>
+    <w:basedOn w:val="DefaultParagraphFont"/>
+    <w:uiPriority w:val="99"/>
+    <w:unhideWhenUsed/>
+    <w:rsid w:val="00742DAD"/>
+    <w:rPr>
+      <w:color w:val="467886" w:themeColor="hyperlink"/>
+      <w:u w:val="single"/>
+    </w:rPr>
+  </w:style>
+  <w:style w:type="character" w:styleId="UnresolvedMention">
+    <w:name w:val="Unresolved Mention"/>
+    <w:basedOn w:val="DefaultParagraphFont"/>
+    <w:uiPriority w:val="99"/>
+    <w:semiHidden/>
+    <w:unhideWhenUsed/>
+    <w:rsid w:val="00742DAD"/>
+    <w:rPr>
+      <w:color w:val="605E5C"/>
+      <w:shd w:val="clear" w:color="auto" w:fill="E1DFDD"/>
+    </w:rPr>
   </w:style>
 </w:styles>
 </file>

</xml_diff>

<commit_message>
minor grammatical fixes for Jen and Feb 2026 posts
</commit_message>
<xml_diff>
--- a/Posts/2026/01(Jan)/UndertheHood/UTH_01(Jan)_2026_CR3BP_Part2.docx
+++ b/Posts/2026/01(Jan)/UndertheHood/UTH_01(Jan)_2026_CR3BP_Part2.docx
@@ -121,19 +121,7 @@
           <w:rPr>
             <w:rStyle w:val="Hyperlink"/>
           </w:rPr>
-          <w:t xml:space="preserve">type </w:t>
-        </w:r>
-        <w:r>
-          <w:rPr>
-            <w:rStyle w:val="Hyperlink"/>
-          </w:rPr>
-          <w:t xml:space="preserve"> </w:t>
-        </w:r>
-        <w:r>
-          <w:rPr>
-            <w:rStyle w:val="Hyperlink"/>
-          </w:rPr>
-          <w:t>forces</w:t>
+          <w:t>type  forces</w:t>
         </w:r>
         <w:proofErr w:type="gramEnd"/>
       </w:hyperlink>
@@ -1833,7 +1821,31 @@
         <w:pStyle w:val="NoSpacing"/>
       </w:pPr>
       <w:r>
-        <w:t>The form of the constant differs somewhat from book to book.  We will depart from A. E. Roy here by expressing that constant as $</w:t>
+        <w:t xml:space="preserve">The form of the constant differs somewhat from book to book.  We will </w:t>
+      </w:r>
+      <w:r>
+        <w:t>follow</w:t>
+      </w:r>
+      <w:r>
+        <w:t xml:space="preserve"> A. E. Roy</w:t>
+      </w:r>
+      <w:r>
+        <w:t xml:space="preserve"> </w:t>
+      </w:r>
+      <w:r>
+        <w:t xml:space="preserve">here </w:t>
+      </w:r>
+      <w:r>
+        <w:t>(except for the subscript)</w:t>
+      </w:r>
+      <w:r>
+        <w:t xml:space="preserve"> </w:t>
+      </w:r>
+      <w:r>
+        <w:t>by expressing that constant as $</w:t>
+      </w:r>
+      <w:r>
+        <w:t>-</w:t>
       </w:r>
       <w:r>
         <w:t>(</w:t>
@@ -2655,6 +2667,7 @@
   <w:style w:type="character" w:default="1" w:styleId="DefaultParagraphFont">
     <w:name w:val="Default Paragraph Font"/>
     <w:uiPriority w:val="1"/>
+    <w:semiHidden/>
     <w:unhideWhenUsed/>
   </w:style>
   <w:style w:type="table" w:default="1" w:styleId="TableNormal">

</xml_diff>